<commit_message>
docs: require Docker-only development sandbox
</commit_message>
<xml_diff>
--- a/PF_Health_Hackathon_Complete_Plan_Updated.docx
+++ b/PF_Health_Hackathon_Complete_Plan_Updated.docx
@@ -144,11 +144,9 @@
           <w:color w:val="183153"/>
           <w:sz w:val="20"/>
         </w:rPr>
-        <w:t>REVISION NOTE  |  Aligned to the repository source of truth on 22 August 2026. One Ravi hero case and R001 are in MVP scope; AI, KYC/bank rules, and extra personas are deferred.</w:t>
+        <w:t>REVISION NOTE  |  Aligned to the repository source of truth on 23 August 2026. One Ravi hero case and R001 are in MVP scope; development and testing are Docker-only; AI, KYC/bank rules, and extra personas are deferred.</w:t>
       </w:r>
-      <w:r>
-        <w:br w:type="page"/>
-      </w:r>
+      <w:r/>
     </w:p>
     <w:p>
       <w:pPr>
@@ -4591,11 +4589,108 @@
           </w:p>
         </w:tc>
       </w:tr>
+      <w:tr>
+        <w:tc>
+          <w:tcPr>
+            <w:tcW w:type="dxa" w:w="2016"/>
+            <w:vAlign w:val="center"/>
+          </w:tcPr>
+          <w:p>
+            <w:r>
+              <w:t>Development sandbox</w:t>
+            </w:r>
+          </w:p>
+        </w:tc>
+        <w:tc>
+          <w:tcPr>
+            <w:tcW w:type="dxa" w:w="3888"/>
+            <w:vAlign w:val="center"/>
+          </w:tcPr>
+          <w:p>
+            <w:r>
+              <w:t>Docker Compose with a non-root app container, dedicated bridge network, and named volumes</w:t>
+            </w:r>
+          </w:p>
+        </w:tc>
+        <w:tc>
+          <w:tcPr>
+            <w:tcW w:type="dxa" w:w="4608"/>
+            <w:vAlign w:val="center"/>
+          </w:tcPr>
+          <w:p>
+            <w:r>
+              <w:t>Keeps installation, execution, tests, builds, and runtime state isolated from the host and unrelated services</w:t>
+            </w:r>
+          </w:p>
+        </w:tc>
+      </w:tr>
     </w:tbl>
     <w:p>
       <w:pPr>
         <w:spacing w:after="20"/>
       </w:pPr>
+    </w:p>
+    <w:p>
+      <w:pPr>
+        <w:pStyle w:val="Heading2"/>
+      </w:pPr>
+      <w:r>
+        <w:t>7.4 Docker-only development sandbox</w:t>
+      </w:r>
+    </w:p>
+    <w:p>
+      <w:pPr/>
+      <w:r>
+        <w:t>Before application bootstrap, create and verify the Docker sandbox. All dependency installation, development servers, scripts, tests, builds, seed/reset operations, and local runtime state run inside PF Health containers. Host-side work is limited to editing files inside pf-health, repository-scoped Git, and PF Health-scoped Docker/Compose commands.</w:t>
+      </w:r>
+    </w:p>
+    <w:p>
+      <w:pPr>
+        <w:pStyle w:val="ListBullet"/>
+      </w:pPr>
+      <w:r>
+        <w:t>Run application processes as a non-root user on a dedicated bridge network.</w:t>
+      </w:r>
+    </w:p>
+    <w:p>
+      <w:pPr>
+        <w:pStyle w:val="ListBullet"/>
+      </w:pPr>
+      <w:r>
+        <w:t>Mount only paths inside pf-health; keep dependencies and mutable state in named volumes or container storage.</w:t>
+      </w:r>
+    </w:p>
+    <w:p>
+      <w:pPr>
+        <w:pStyle w:val="ListBullet"/>
+      </w:pPr>
+      <w:r>
+        <w:t>Bind required ports to 127.0.0.1 only.</w:t>
+      </w:r>
+    </w:p>
+    <w:p>
+      <w:pPr>
+        <w:pStyle w:val="ListBullet"/>
+      </w:pPr>
+      <w:r>
+        <w:t>Do not use privileged mode, host networking, host PID/IPC, device mounts, added capabilities, or Docker socket mounts.</w:t>
+      </w:r>
+    </w:p>
+    <w:p>
+      <w:pPr>
+        <w:pStyle w:val="ListBullet"/>
+      </w:pPr>
+      <w:r>
+        <w:t>Never stop, prune, or otherwise mutate unrelated Docker containers, images, volumes, networks, or services.</w:t>
+      </w:r>
+    </w:p>
+    <w:p>
+      <w:pPr>
+        <w:pStyle w:val="ListBullet"/>
+      </w:pPr>
+      <w:r>
+        <w:t>If the workflow cannot run within these boundaries, stop and request a human decision instead of using the host runtime.</w:t>
+      </w:r>
     </w:p>
     <w:p>
       <w:pPr>
@@ -7180,6 +7275,30 @@
           </w:p>
         </w:tc>
       </w:tr>
+      <w:tr>
+        <w:tc>
+          <w:tcPr>
+            <w:tcW w:type="dxa" w:w="2016"/>
+            <w:vAlign w:val="center"/>
+          </w:tcPr>
+          <w:p>
+            <w:r>
+              <w:t>Sandbox</w:t>
+            </w:r>
+          </w:p>
+        </w:tc>
+        <w:tc>
+          <w:tcPr>
+            <w:tcW w:type="dxa" w:w="8064"/>
+            <w:vAlign w:val="center"/>
+          </w:tcPr>
+          <w:p>
+            <w:r>
+              <w:t>Resolved Compose configuration; non-root user; repository-only mounts; isolated network; localhost-only ports; no privileged/host namespaces, devices, or Docker socket</w:t>
+            </w:r>
+          </w:p>
+        </w:tc>
+      </w:tr>
     </w:tbl>
     <w:p>
       <w:pPr>
@@ -7265,21 +7384,23 @@
         <w:pStyle w:val="CodeLike"/>
       </w:pPr>
       <w:r>
-        <w:t>npm run dev</w:t>
+        <w:t>docker compose build app</w:t>
         <w:br/>
-        <w:t>npm run lint</w:t>
+        <w:t>docker compose run --rm app npm run lint</w:t>
         <w:br/>
-        <w:t>npm run typecheck</w:t>
+        <w:t>docker compose run --rm app npm run typecheck</w:t>
         <w:br/>
-        <w:t>npm run test</w:t>
+        <w:t>docker compose run --rm app npm run test</w:t>
         <w:br/>
-        <w:t>npm run test:e2e</w:t>
+        <w:t>docker compose run --rm app npm run test:e2e</w:t>
         <w:br/>
-        <w:t>npm run seed:demo</w:t>
+        <w:t>docker compose run --rm app npm run seed:demo</w:t>
         <w:br/>
-        <w:t>npm run reset:demo</w:t>
+        <w:t>docker compose run --rm app npm run reset:demo</w:t>
         <w:br/>
-        <w:t>npm run check</w:t>
+        <w:t>docker compose run --rm app npm run check</w:t>
+        <w:br/>
+        <w:t>docker compose up app</w:t>
       </w:r>
     </w:p>
     <w:p>
@@ -7338,7 +7459,7 @@
               <w:spacing w:after="0"/>
             </w:pPr>
             <w:r>
-              <w:t>The prototype should be feature-complete by 25 August, polished and frozen on 26 August, and submission day should be reserved for verification, recording, and contingency.</w:t>
+              <w:t>All development execution and testing must remain inside the PF Health Docker sandbox; host-native fallback is prohibited. The prototype should be feature-complete by 25 August, polished and frozen on 26 August, and submission day should be reserved for verification, recording, and contingency.</w:t>
             </w:r>
           </w:p>
         </w:tc>
@@ -7734,7 +7855,15 @@
         <w:spacing w:after="50"/>
       </w:pPr>
       <w:r>
-        <w:t>Bootstrap the pinned Next.js/TypeScript project with strict configuration and no feature code.</w:t>
+        <w:t>Create and verify Dockerfile, compose.yaml, and .dockerignore with a non-root app user, isolated network, repository-only mounts, named dependency/runtime volumes, and localhost-only ports.</w:t>
+      </w:r>
+    </w:p>
+    <w:p>
+      <w:pPr>
+        <w:pStyle w:val="ListBullet"/>
+      </w:pPr>
+      <w:r>
+        <w:t>Bootstrap the pinned Next.js/TypeScript project with strict configuration and no feature code inside the verified container sandbox.</w:t>
       </w:r>
     </w:p>
     <w:p>
@@ -8172,11 +8301,6 @@
       </w:pPr>
       <w:r>
         <w:t>Capture submission confirmation and exact deployed commit hash.</w:t>
-      </w:r>
-    </w:p>
-    <w:p>
-      <w:r>
-        <w:br w:type="page"/>
       </w:r>
     </w:p>
     <w:p>
@@ -11199,7 +11323,7 @@
         <w:color w:val="475569"/>
         <w:sz w:val="16"/>
       </w:rPr>
-      <w:t>Independent hackathon prototype · Synthetic data only · Repository-aligned 22 August 2026</w:t>
+      <w:t>Independent hackathon prototype · Synthetic data only · Repository-aligned 23 August 2026</w:t>
     </w:r>
   </w:p>
   <w:p>

</xml_diff>